<commit_message>
docs: add real screenshots to the project report
Drive the built app through headless Chrome to capture the menu, the pilot
cards, level six mid-play and the level one completion screen, then embed
them in the report in place of the blank placeholders.

Co-Authored-By: Claude Opus 5 <noreply@anthropic.com>
Claude-Session: https://claude.ai/code/session_014hTrp2EGFtPgrGpyQo7GTN
</commit_message>
<xml_diff>
--- a/report/UID-Mini-Project-Report.docx
+++ b/report/UID-Mini-Project-Report.docx
@@ -3355,6 +3355,11 @@
       </w:r>
     </w:p>
     <w:p>
+      <w:r>
+        <w:br w:type="page"/>
+      </w:r>
+    </w:p>
+    <w:p>
       <w:pPr>
         <w:pStyle w:val="Heading2"/>
         <w:spacing w:after="120" w:before="200" w:line="360"/>
@@ -3372,94 +3377,56 @@
     </w:p>
     <w:p>
       <w:pPr>
-        <w:spacing w:line="360"/>
-      </w:pPr>
-      <w:r>
-        <w:rPr>
-          <w:sz w:val="24"/>
-          <w:szCs w:val="24"/>
-        </w:rPr>
-        <w:t xml:space="preserve"/>
-      </w:r>
-    </w:p>
-    <w:p>
-      <w:pPr>
-        <w:spacing w:line="360"/>
-      </w:pPr>
-      <w:r>
-        <w:rPr>
-          <w:sz w:val="24"/>
-          <w:szCs w:val="24"/>
-        </w:rPr>
-        <w:t xml:space="preserve"/>
-      </w:r>
-    </w:p>
-    <w:p>
-      <w:pPr>
-        <w:spacing w:line="360"/>
-      </w:pPr>
-      <w:r>
-        <w:rPr>
-          <w:sz w:val="24"/>
-          <w:szCs w:val="24"/>
-        </w:rPr>
-        <w:t xml:space="preserve"/>
-      </w:r>
-    </w:p>
-    <w:p>
-      <w:pPr>
-        <w:spacing w:line="360"/>
-      </w:pPr>
-      <w:r>
-        <w:rPr>
-          <w:sz w:val="24"/>
-          <w:szCs w:val="24"/>
-        </w:rPr>
-        <w:t xml:space="preserve"/>
-      </w:r>
-    </w:p>
-    <w:p>
-      <w:pPr>
-        <w:spacing w:line="360"/>
-      </w:pPr>
-      <w:r>
-        <w:rPr>
-          <w:sz w:val="24"/>
-          <w:szCs w:val="24"/>
-        </w:rPr>
-        <w:t xml:space="preserve"/>
-      </w:r>
-    </w:p>
-    <w:p>
-      <w:pPr>
-        <w:spacing w:line="360"/>
-      </w:pPr>
-      <w:r>
-        <w:rPr>
-          <w:sz w:val="24"/>
-          <w:szCs w:val="24"/>
-        </w:rPr>
-        <w:t xml:space="preserve"/>
-      </w:r>
-    </w:p>
-    <w:p>
-      <w:pPr>
-        <w:spacing w:line="360"/>
-      </w:pPr>
-      <w:r>
-        <w:rPr>
-          <w:sz w:val="24"/>
-          <w:szCs w:val="24"/>
-        </w:rPr>
-        <w:t xml:space="preserve"/>
-      </w:r>
-    </w:p>
-    <w:p>
-      <w:pPr>
-        <w:spacing w:after="240" w:line="360"/>
+        <w:spacing w:after="80" w:before="160" w:line="240"/>
         <w:jc w:val="center"/>
       </w:pPr>
       <w:r>
+        <w:drawing>
+          <wp:inline distT="0" distB="0" distL="0" distR="0">
+            <wp:extent cx="5524500" cy="3457575"/>
+            <wp:effectExtent t="0" r="0" b="0" l="0"/>
+            <wp:docPr id="1" name="" descr="" title=""/>
+            <wp:cNvGraphicFramePr>
+              <a:graphicFrameLocks xmlns:a="http://schemas.openxmlformats.org/drawingml/2006/main" noChangeAspect="1"/>
+            </wp:cNvGraphicFramePr>
+            <a:graphic xmlns:a="http://schemas.openxmlformats.org/drawingml/2006/main">
+              <a:graphicData uri="http://schemas.openxmlformats.org/drawingml/2006/picture">
+                <pic:pic xmlns:pic="http://schemas.openxmlformats.org/drawingml/2006/picture">
+                  <pic:nvPicPr>
+                    <pic:cNvPr id="0" name="" descr=""/>
+                    <pic:cNvPicPr>
+                      <a:picLocks noChangeAspect="1" noChangeArrowheads="1"/>
+                    </pic:cNvPicPr>
+                  </pic:nvPicPr>
+                  <pic:blipFill>
+                    <a:blip r:embed="rId8" cstate="none"/>
+                    <a:srcRect/>
+                    <a:stretch>
+                      <a:fillRect/>
+                    </a:stretch>
+                  </pic:blipFill>
+                  <pic:spPr bwMode="auto">
+                    <a:xfrm>
+                      <a:off x="0" y="0"/>
+                      <a:ext cx="5524500" cy="3457575"/>
+                    </a:xfrm>
+                    <a:prstGeom prst="rect">
+                      <a:avLst/>
+                    </a:prstGeom>
+                  </pic:spPr>
+                </pic:pic>
+              </a:graphicData>
+            </a:graphic>
+          </wp:inline>
+        </w:drawing>
+      </w:r>
+    </w:p>
+    <w:p>
+      <w:pPr>
+        <w:spacing w:after="260" w:line="360"/>
+        <w:jc w:val="center"/>
+      </w:pPr>
+      <w:r>
         <w:rPr>
           <w:sz w:val="24"/>
           <w:szCs w:val="24"/>
@@ -3469,94 +3436,56 @@
     </w:p>
     <w:p>
       <w:pPr>
-        <w:spacing w:line="360"/>
-      </w:pPr>
-      <w:r>
-        <w:rPr>
-          <w:sz w:val="24"/>
-          <w:szCs w:val="24"/>
-        </w:rPr>
-        <w:t xml:space="preserve"/>
-      </w:r>
-    </w:p>
-    <w:p>
-      <w:pPr>
-        <w:spacing w:line="360"/>
-      </w:pPr>
-      <w:r>
-        <w:rPr>
-          <w:sz w:val="24"/>
-          <w:szCs w:val="24"/>
-        </w:rPr>
-        <w:t xml:space="preserve"/>
-      </w:r>
-    </w:p>
-    <w:p>
-      <w:pPr>
-        <w:spacing w:line="360"/>
-      </w:pPr>
-      <w:r>
-        <w:rPr>
-          <w:sz w:val="24"/>
-          <w:szCs w:val="24"/>
-        </w:rPr>
-        <w:t xml:space="preserve"/>
-      </w:r>
-    </w:p>
-    <w:p>
-      <w:pPr>
-        <w:spacing w:line="360"/>
-      </w:pPr>
-      <w:r>
-        <w:rPr>
-          <w:sz w:val="24"/>
-          <w:szCs w:val="24"/>
-        </w:rPr>
-        <w:t xml:space="preserve"/>
-      </w:r>
-    </w:p>
-    <w:p>
-      <w:pPr>
-        <w:spacing w:line="360"/>
-      </w:pPr>
-      <w:r>
-        <w:rPr>
-          <w:sz w:val="24"/>
-          <w:szCs w:val="24"/>
-        </w:rPr>
-        <w:t xml:space="preserve"/>
-      </w:r>
-    </w:p>
-    <w:p>
-      <w:pPr>
-        <w:spacing w:line="360"/>
-      </w:pPr>
-      <w:r>
-        <w:rPr>
-          <w:sz w:val="24"/>
-          <w:szCs w:val="24"/>
-        </w:rPr>
-        <w:t xml:space="preserve"/>
-      </w:r>
-    </w:p>
-    <w:p>
-      <w:pPr>
-        <w:spacing w:line="360"/>
-      </w:pPr>
-      <w:r>
-        <w:rPr>
-          <w:sz w:val="24"/>
-          <w:szCs w:val="24"/>
-        </w:rPr>
-        <w:t xml:space="preserve"/>
-      </w:r>
-    </w:p>
-    <w:p>
-      <w:pPr>
-        <w:spacing w:after="240" w:line="360"/>
+        <w:spacing w:after="80" w:before="160" w:line="240"/>
         <w:jc w:val="center"/>
       </w:pPr>
       <w:r>
+        <w:drawing>
+          <wp:inline distT="0" distB="0" distL="0" distR="0">
+            <wp:extent cx="5524500" cy="2238375"/>
+            <wp:effectExtent t="0" r="0" b="0" l="0"/>
+            <wp:docPr id="1" name="" descr="" title=""/>
+            <wp:cNvGraphicFramePr>
+              <a:graphicFrameLocks xmlns:a="http://schemas.openxmlformats.org/drawingml/2006/main" noChangeAspect="1"/>
+            </wp:cNvGraphicFramePr>
+            <a:graphic xmlns:a="http://schemas.openxmlformats.org/drawingml/2006/main">
+              <a:graphicData uri="http://schemas.openxmlformats.org/drawingml/2006/picture">
+                <pic:pic xmlns:pic="http://schemas.openxmlformats.org/drawingml/2006/picture">
+                  <pic:nvPicPr>
+                    <pic:cNvPr id="0" name="" descr=""/>
+                    <pic:cNvPicPr>
+                      <a:picLocks noChangeAspect="1" noChangeArrowheads="1"/>
+                    </pic:cNvPicPr>
+                  </pic:nvPicPr>
+                  <pic:blipFill>
+                    <a:blip r:embed="rId9" cstate="none"/>
+                    <a:srcRect/>
+                    <a:stretch>
+                      <a:fillRect/>
+                    </a:stretch>
+                  </pic:blipFill>
+                  <pic:spPr bwMode="auto">
+                    <a:xfrm>
+                      <a:off x="0" y="0"/>
+                      <a:ext cx="5524500" cy="2238375"/>
+                    </a:xfrm>
+                    <a:prstGeom prst="rect">
+                      <a:avLst/>
+                    </a:prstGeom>
+                  </pic:spPr>
+                </pic:pic>
+              </a:graphicData>
+            </a:graphic>
+          </wp:inline>
+        </w:drawing>
+      </w:r>
+    </w:p>
+    <w:p>
+      <w:pPr>
+        <w:spacing w:after="260" w:line="360"/>
+        <w:jc w:val="center"/>
+      </w:pPr>
+      <w:r>
         <w:rPr>
           <w:sz w:val="24"/>
           <w:szCs w:val="24"/>
@@ -3566,94 +3495,56 @@
     </w:p>
     <w:p>
       <w:pPr>
-        <w:spacing w:line="360"/>
-      </w:pPr>
-      <w:r>
-        <w:rPr>
-          <w:sz w:val="24"/>
-          <w:szCs w:val="24"/>
-        </w:rPr>
-        <w:t xml:space="preserve"/>
-      </w:r>
-    </w:p>
-    <w:p>
-      <w:pPr>
-        <w:spacing w:line="360"/>
-      </w:pPr>
-      <w:r>
-        <w:rPr>
-          <w:sz w:val="24"/>
-          <w:szCs w:val="24"/>
-        </w:rPr>
-        <w:t xml:space="preserve"/>
-      </w:r>
-    </w:p>
-    <w:p>
-      <w:pPr>
-        <w:spacing w:line="360"/>
-      </w:pPr>
-      <w:r>
-        <w:rPr>
-          <w:sz w:val="24"/>
-          <w:szCs w:val="24"/>
-        </w:rPr>
-        <w:t xml:space="preserve"/>
-      </w:r>
-    </w:p>
-    <w:p>
-      <w:pPr>
-        <w:spacing w:line="360"/>
-      </w:pPr>
-      <w:r>
-        <w:rPr>
-          <w:sz w:val="24"/>
-          <w:szCs w:val="24"/>
-        </w:rPr>
-        <w:t xml:space="preserve"/>
-      </w:r>
-    </w:p>
-    <w:p>
-      <w:pPr>
-        <w:spacing w:line="360"/>
-      </w:pPr>
-      <w:r>
-        <w:rPr>
-          <w:sz w:val="24"/>
-          <w:szCs w:val="24"/>
-        </w:rPr>
-        <w:t xml:space="preserve"/>
-      </w:r>
-    </w:p>
-    <w:p>
-      <w:pPr>
-        <w:spacing w:line="360"/>
-      </w:pPr>
-      <w:r>
-        <w:rPr>
-          <w:sz w:val="24"/>
-          <w:szCs w:val="24"/>
-        </w:rPr>
-        <w:t xml:space="preserve"/>
-      </w:r>
-    </w:p>
-    <w:p>
-      <w:pPr>
-        <w:spacing w:line="360"/>
-      </w:pPr>
-      <w:r>
-        <w:rPr>
-          <w:sz w:val="24"/>
-          <w:szCs w:val="24"/>
-        </w:rPr>
-        <w:t xml:space="preserve"/>
-      </w:r>
-    </w:p>
-    <w:p>
-      <w:pPr>
-        <w:spacing w:after="240" w:line="360"/>
+        <w:spacing w:after="80" w:before="160" w:line="240"/>
         <w:jc w:val="center"/>
       </w:pPr>
       <w:r>
+        <w:drawing>
+          <wp:inline distT="0" distB="0" distL="0" distR="0">
+            <wp:extent cx="5524500" cy="2943225"/>
+            <wp:effectExtent t="0" r="0" b="0" l="0"/>
+            <wp:docPr id="1" name="" descr="" title=""/>
+            <wp:cNvGraphicFramePr>
+              <a:graphicFrameLocks xmlns:a="http://schemas.openxmlformats.org/drawingml/2006/main" noChangeAspect="1"/>
+            </wp:cNvGraphicFramePr>
+            <a:graphic xmlns:a="http://schemas.openxmlformats.org/drawingml/2006/main">
+              <a:graphicData uri="http://schemas.openxmlformats.org/drawingml/2006/picture">
+                <pic:pic xmlns:pic="http://schemas.openxmlformats.org/drawingml/2006/picture">
+                  <pic:nvPicPr>
+                    <pic:cNvPr id="0" name="" descr=""/>
+                    <pic:cNvPicPr>
+                      <a:picLocks noChangeAspect="1" noChangeArrowheads="1"/>
+                    </pic:cNvPicPr>
+                  </pic:nvPicPr>
+                  <pic:blipFill>
+                    <a:blip r:embed="rId10" cstate="none"/>
+                    <a:srcRect/>
+                    <a:stretch>
+                      <a:fillRect/>
+                    </a:stretch>
+                  </pic:blipFill>
+                  <pic:spPr bwMode="auto">
+                    <a:xfrm>
+                      <a:off x="0" y="0"/>
+                      <a:ext cx="5524500" cy="2943225"/>
+                    </a:xfrm>
+                    <a:prstGeom prst="rect">
+                      <a:avLst/>
+                    </a:prstGeom>
+                  </pic:spPr>
+                </pic:pic>
+              </a:graphicData>
+            </a:graphic>
+          </wp:inline>
+        </w:drawing>
+      </w:r>
+    </w:p>
+    <w:p>
+      <w:pPr>
+        <w:spacing w:after="260" w:line="360"/>
+        <w:jc w:val="center"/>
+      </w:pPr>
+      <w:r>
         <w:rPr>
           <w:sz w:val="24"/>
           <w:szCs w:val="24"/>
@@ -3663,91 +3554,53 @@
     </w:p>
     <w:p>
       <w:pPr>
-        <w:spacing w:line="360"/>
-      </w:pPr>
-      <w:r>
-        <w:rPr>
-          <w:sz w:val="24"/>
-          <w:szCs w:val="24"/>
-        </w:rPr>
-        <w:t xml:space="preserve"/>
-      </w:r>
-    </w:p>
-    <w:p>
-      <w:pPr>
-        <w:spacing w:line="360"/>
-      </w:pPr>
-      <w:r>
-        <w:rPr>
-          <w:sz w:val="24"/>
-          <w:szCs w:val="24"/>
-        </w:rPr>
-        <w:t xml:space="preserve"/>
-      </w:r>
-    </w:p>
-    <w:p>
-      <w:pPr>
-        <w:spacing w:line="360"/>
-      </w:pPr>
-      <w:r>
-        <w:rPr>
-          <w:sz w:val="24"/>
-          <w:szCs w:val="24"/>
-        </w:rPr>
-        <w:t xml:space="preserve"/>
-      </w:r>
-    </w:p>
-    <w:p>
-      <w:pPr>
-        <w:spacing w:line="360"/>
-      </w:pPr>
-      <w:r>
-        <w:rPr>
-          <w:sz w:val="24"/>
-          <w:szCs w:val="24"/>
-        </w:rPr>
-        <w:t xml:space="preserve"/>
-      </w:r>
-    </w:p>
-    <w:p>
-      <w:pPr>
-        <w:spacing w:line="360"/>
-      </w:pPr>
-      <w:r>
-        <w:rPr>
-          <w:sz w:val="24"/>
-          <w:szCs w:val="24"/>
-        </w:rPr>
-        <w:t xml:space="preserve"/>
-      </w:r>
-    </w:p>
-    <w:p>
-      <w:pPr>
-        <w:spacing w:line="360"/>
-      </w:pPr>
-      <w:r>
-        <w:rPr>
-          <w:sz w:val="24"/>
-          <w:szCs w:val="24"/>
-        </w:rPr>
-        <w:t xml:space="preserve"/>
-      </w:r>
-    </w:p>
-    <w:p>
-      <w:pPr>
-        <w:spacing w:line="360"/>
-      </w:pPr>
-      <w:r>
-        <w:rPr>
-          <w:sz w:val="24"/>
-          <w:szCs w:val="24"/>
-        </w:rPr>
-        <w:t xml:space="preserve"/>
-      </w:r>
-    </w:p>
-    <w:p>
-      <w:pPr>
-        <w:spacing w:after="240" w:line="360"/>
+        <w:spacing w:after="80" w:before="160" w:line="240"/>
+        <w:jc w:val="center"/>
+      </w:pPr>
+      <w:r>
+        <w:drawing>
+          <wp:inline distT="0" distB="0" distL="0" distR="0">
+            <wp:extent cx="5524500" cy="2943225"/>
+            <wp:effectExtent t="0" r="0" b="0" l="0"/>
+            <wp:docPr id="1" name="" descr="" title=""/>
+            <wp:cNvGraphicFramePr>
+              <a:graphicFrameLocks xmlns:a="http://schemas.openxmlformats.org/drawingml/2006/main" noChangeAspect="1"/>
+            </wp:cNvGraphicFramePr>
+            <a:graphic xmlns:a="http://schemas.openxmlformats.org/drawingml/2006/main">
+              <a:graphicData uri="http://schemas.openxmlformats.org/drawingml/2006/picture">
+                <pic:pic xmlns:pic="http://schemas.openxmlformats.org/drawingml/2006/picture">
+                  <pic:nvPicPr>
+                    <pic:cNvPr id="0" name="" descr=""/>
+                    <pic:cNvPicPr>
+                      <a:picLocks noChangeAspect="1" noChangeArrowheads="1"/>
+                    </pic:cNvPicPr>
+                  </pic:nvPicPr>
+                  <pic:blipFill>
+                    <a:blip r:embed="rId11" cstate="none"/>
+                    <a:srcRect/>
+                    <a:stretch>
+                      <a:fillRect/>
+                    </a:stretch>
+                  </pic:blipFill>
+                  <pic:spPr bwMode="auto">
+                    <a:xfrm>
+                      <a:off x="0" y="0"/>
+                      <a:ext cx="5524500" cy="2943225"/>
+                    </a:xfrm>
+                    <a:prstGeom prst="rect">
+                      <a:avLst/>
+                    </a:prstGeom>
+                  </pic:spPr>
+                </pic:pic>
+              </a:graphicData>
+            </a:graphic>
+          </wp:inline>
+        </w:drawing>
+      </w:r>
+    </w:p>
+    <w:p>
+      <w:pPr>
+        <w:spacing w:after="260" w:line="360"/>
         <w:jc w:val="center"/>
       </w:pPr>
       <w:r>

</xml_diff>

<commit_message>
docs: fill in the team names on the report cover
Also track the PDF alongside the docx.

Co-Authored-By: Claude Opus 5 <noreply@anthropic.com>
Claude-Session: https://claude.ai/code/session_014hTrp2EGFtPgrGpyQo7GTN
</commit_message>
<xml_diff>
--- a/report/UID-Mini-Project-Report.docx
+++ b/report/UID-Mini-Project-Report.docx
@@ -235,7 +235,7 @@
                 <w:sz w:val="22"/>
                 <w:szCs w:val="22"/>
               </w:rPr>
-              <w:t xml:space="preserve">&lt;Name&gt;</w:t>
+              <w:t xml:space="preserve">Ujwal Hegde</w:t>
             </w:r>
           </w:p>
         </w:tc>
@@ -269,7 +269,7 @@
                 <w:sz w:val="22"/>
                 <w:szCs w:val="22"/>
               </w:rPr>
-              <w:t xml:space="preserve">&lt;USN&gt;</w:t>
+              <w:t xml:space="preserve">NNM23IS201</w:t>
             </w:r>
           </w:p>
         </w:tc>
@@ -308,7 +308,7 @@
                 <w:sz w:val="22"/>
                 <w:szCs w:val="22"/>
               </w:rPr>
-              <w:t xml:space="preserve">&lt;Name&gt;</w:t>
+              <w:t xml:space="preserve">K Aravind Kamath</w:t>
             </w:r>
           </w:p>
         </w:tc>
@@ -342,7 +342,7 @@
                 <w:sz w:val="22"/>
                 <w:szCs w:val="22"/>
               </w:rPr>
-              <w:t xml:space="preserve">&lt;USN&gt;</w:t>
+              <w:t xml:space="preserve">NNM23IS082</w:t>
             </w:r>
           </w:p>
         </w:tc>

</xml_diff>